<commit_message>
Add Planned pitch status; update release notes
- Planned status option in Add Pitch dropdown
- badge-planned / pill-planned CSS (indigo)
- statusClass() handles 'planned'
- pairCounts tracks planned separately
- Filter pill for planned status in summary bar
- hasFilter and filter-matching updated in game and pub views
- Publisher/game row shows Planned badge when latest status is planned
- Planned entries don't trigger age clock (already excluded by ageTag)
- Release notes: CLEAR buttons, Include Compendium rename, profile dirty-check,
  date fix, new-game search fix, contact email parsing, Planned status
</commit_message>
<xml_diff>
--- a/Compendium_Release_Notes.docx
+++ b/Compendium_Release_Notes.docx
@@ -667,6 +667,389 @@
           <w:szCs w:val="20"/>
         </w:rPr>
         <w:t xml:space="preserve">Fixed: Publisher view and filter bar now rebuild immediately after saving a Compendium Code — no page refresh needed.</w:t>
+      </w:r>
+    </w:p>
+    <w:p>
+      <w:pPr>
+        <w:pStyle w:val="Heading1"/>
+        <w:spacing w:after="120" w:before="360"/>
+      </w:pPr>
+      <w:r>
+        <w:rPr>
+          <w:b/>
+          <w:bCs/>
+          <w:color w:val="1a1a2e"/>
+        </w:rPr>
+        <w:t xml:space="preserve">September 2026 Update</w:t>
+      </w:r>
+    </w:p>
+    <w:p>
+      <w:pPr>
+        <w:pStyle w:val="Heading2"/>
+        <w:spacing w:after="80" w:before="240"/>
+      </w:pPr>
+      <w:r>
+        <w:rPr>
+          <w:b/>
+          <w:bCs/>
+          <w:color w:val="1a1a2e"/>
+        </w:rPr>
+        <w:t xml:space="preserve">New Features</w:t>
+      </w:r>
+    </w:p>
+    <w:p>
+      <w:pPr>
+        <w:spacing w:after="60"/>
+      </w:pPr>
+      <w:r>
+        <w:rPr>
+          <w:b/>
+          <w:bCs/>
+          <w:color w:val="1a1a2e"/>
+          <w:sz w:val="20"/>
+          <w:szCs w:val="20"/>
+        </w:rPr>
+        <w:t xml:space="preserve">"Planned" Pitch Status</w:t>
+      </w:r>
+    </w:p>
+    <w:p>
+      <w:pPr>
+        <w:pStyle w:val="ListParagraph"/>
+        <w:numPr>
+          <w:ilvl w:val="0"/>
+          <w:numId w:val="1"/>
+        </w:numPr>
+        <w:spacing w:after="60"/>
+      </w:pPr>
+      <w:r>
+        <w:rPr>
+          <w:sz w:val="20"/>
+          <w:szCs w:val="20"/>
+        </w:rPr>
+        <w:t xml:space="preserve">A new pitch status, Planned, is available in the Add Pitch dialog.</w:t>
+      </w:r>
+    </w:p>
+    <w:p>
+      <w:pPr>
+        <w:pStyle w:val="ListParagraph"/>
+        <w:numPr>
+          <w:ilvl w:val="0"/>
+          <w:numId w:val="1"/>
+        </w:numPr>
+        <w:spacing w:after="60"/>
+      </w:pPr>
+      <w:r>
+        <w:rPr>
+          <w:sz w:val="20"/>
+          <w:szCs w:val="20"/>
+        </w:rPr>
+        <w:t xml:space="preserve">Use Planned to record a publisher you intend to pitch in the future — before any actual outreach has occurred.</w:t>
+      </w:r>
+    </w:p>
+    <w:p>
+      <w:pPr>
+        <w:pStyle w:val="ListParagraph"/>
+        <w:numPr>
+          <w:ilvl w:val="0"/>
+          <w:numId w:val="1"/>
+        </w:numPr>
+        <w:spacing w:after="60"/>
+      </w:pPr>
+      <w:r>
+        <w:rPr>
+          <w:sz w:val="20"/>
+          <w:szCs w:val="20"/>
+        </w:rPr>
+        <w:t xml:space="preserve">Planned entries show an indigo badge on publisher and game rows, and a Planned filter pill in the status bar.</w:t>
+      </w:r>
+    </w:p>
+    <w:p>
+      <w:pPr>
+        <w:pStyle w:val="ListParagraph"/>
+        <w:numPr>
+          <w:ilvl w:val="0"/>
+          <w:numId w:val="1"/>
+        </w:numPr>
+        <w:spacing w:after="60"/>
+      </w:pPr>
+      <w:r>
+        <w:rPr>
+          <w:sz w:val="20"/>
+          <w:szCs w:val="20"/>
+        </w:rPr>
+        <w:t xml:space="preserve">Planned entries do not trigger the age clock (3mo+ / 6mo+ follow-up badges).</w:t>
+      </w:r>
+    </w:p>
+    <w:p>
+      <w:pPr>
+        <w:spacing w:after="100"/>
+      </w:pPr>
+      <w:r>
+        <w:rPr>
+          <w:sz w:val="20"/>
+          <w:szCs w:val="20"/>
+        </w:rPr>
+        <w:t xml:space="preserve"/>
+      </w:r>
+    </w:p>
+    <w:p>
+      <w:pPr>
+        <w:spacing w:after="60"/>
+      </w:pPr>
+      <w:r>
+        <w:rPr>
+          <w:b/>
+          <w:bCs/>
+          <w:color w:val="1a1a2e"/>
+          <w:sz w:val="20"/>
+          <w:szCs w:val="20"/>
+        </w:rPr>
+        <w:t xml:space="preserve">CLEAR Buttons on Compendium Filters</w:t>
+      </w:r>
+    </w:p>
+    <w:p>
+      <w:pPr>
+        <w:pStyle w:val="ListParagraph"/>
+        <w:numPr>
+          <w:ilvl w:val="0"/>
+          <w:numId w:val="1"/>
+        </w:numPr>
+        <w:spacing w:after="60"/>
+      </w:pPr>
+      <w:r>
+        <w:rPr>
+          <w:sz w:val="20"/>
+          <w:szCs w:val="20"/>
+        </w:rPr>
+        <w:t xml:space="preserve">Each filter column (Categories of Interest, Conventions) now has a CLEAR button at the top right of its header.</w:t>
+      </w:r>
+    </w:p>
+    <w:p>
+      <w:pPr>
+        <w:pStyle w:val="ListParagraph"/>
+        <w:numPr>
+          <w:ilvl w:val="0"/>
+          <w:numId w:val="1"/>
+        </w:numPr>
+        <w:spacing w:after="60"/>
+      </w:pPr>
+      <w:r>
+        <w:rPr>
+          <w:sz w:val="20"/>
+          <w:szCs w:val="20"/>
+        </w:rPr>
+        <w:t xml:space="preserve">Clicking CLEAR removes all active selections in that column and rebuilds the view immediately.</w:t>
+      </w:r>
+    </w:p>
+    <w:p>
+      <w:pPr>
+        <w:spacing w:after="100"/>
+      </w:pPr>
+      <w:r>
+        <w:rPr>
+          <w:sz w:val="20"/>
+          <w:szCs w:val="20"/>
+        </w:rPr>
+        <w:t xml:space="preserve"/>
+      </w:r>
+    </w:p>
+    <w:p>
+      <w:pPr>
+        <w:spacing w:after="60"/>
+      </w:pPr>
+      <w:r>
+        <w:rPr>
+          <w:b/>
+          <w:bCs/>
+          <w:color w:val="1a1a2e"/>
+          <w:sz w:val="20"/>
+          <w:szCs w:val="20"/>
+        </w:rPr>
+        <w:t xml:space="preserve">“Include Compendium” Rename</w:t>
+      </w:r>
+    </w:p>
+    <w:p>
+      <w:pPr>
+        <w:pStyle w:val="ListParagraph"/>
+        <w:numPr>
+          <w:ilvl w:val="0"/>
+          <w:numId w:val="1"/>
+        </w:numPr>
+        <w:spacing w:after="60"/>
+      </w:pPr>
+      <w:r>
+        <w:rPr>
+          <w:sz w:val="20"/>
+          <w:szCs w:val="20"/>
+        </w:rPr>
+        <w:t xml:space="preserve">The “Show All” toggle in the Compendium filter panel has been renamed to “Include Compendium” for clarity.</w:t>
+      </w:r>
+    </w:p>
+    <w:p>
+      <w:pPr>
+        <w:spacing w:after="100"/>
+      </w:pPr>
+      <w:r>
+        <w:rPr>
+          <w:sz w:val="20"/>
+          <w:szCs w:val="20"/>
+        </w:rPr>
+        <w:t xml:space="preserve"/>
+      </w:r>
+    </w:p>
+    <w:p>
+      <w:pPr>
+        <w:spacing w:after="60"/>
+      </w:pPr>
+      <w:r>
+        <w:rPr>
+          <w:b/>
+          <w:bCs/>
+          <w:color w:val="1a1a2e"/>
+          <w:sz w:val="20"/>
+          <w:szCs w:val="20"/>
+        </w:rPr>
+        <w:t xml:space="preserve">Profile Dialog — Dirty-Check, Escape &amp; Backdrop</w:t>
+      </w:r>
+    </w:p>
+    <w:p>
+      <w:pPr>
+        <w:pStyle w:val="ListParagraph"/>
+        <w:numPr>
+          <w:ilvl w:val="0"/>
+          <w:numId w:val="1"/>
+        </w:numPr>
+        <w:spacing w:after="60"/>
+      </w:pPr>
+      <w:r>
+        <w:rPr>
+          <w:sz w:val="20"/>
+          <w:szCs w:val="20"/>
+        </w:rPr>
+        <w:t xml:space="preserve">The Profile dialog now follows the standard dialog pattern used throughout PitchBoard.</w:t>
+      </w:r>
+    </w:p>
+    <w:p>
+      <w:pPr>
+        <w:pStyle w:val="ListParagraph"/>
+        <w:numPr>
+          <w:ilvl w:val="0"/>
+          <w:numId w:val="1"/>
+        </w:numPr>
+        <w:spacing w:after="60"/>
+      </w:pPr>
+      <w:r>
+        <w:rPr>
+          <w:sz w:val="20"/>
+          <w:szCs w:val="20"/>
+        </w:rPr>
+        <w:t xml:space="preserve">Closing with the X button, pressing Escape, or clicking the backdrop while there are unsaved changes shakes the dialog instead of closing it.</w:t>
+      </w:r>
+    </w:p>
+    <w:p>
+      <w:pPr>
+        <w:pStyle w:val="ListParagraph"/>
+        <w:numPr>
+          <w:ilvl w:val="0"/>
+          <w:numId w:val="1"/>
+        </w:numPr>
+        <w:spacing w:after="60"/>
+      </w:pPr>
+      <w:r>
+        <w:rPr>
+          <w:sz w:val="20"/>
+          <w:szCs w:val="20"/>
+        </w:rPr>
+        <w:t xml:space="preserve">The Cancel button always closes immediately without checking for changes.</w:t>
+      </w:r>
+    </w:p>
+    <w:p>
+      <w:pPr>
+        <w:spacing w:after="100"/>
+      </w:pPr>
+      <w:r>
+        <w:rPr>
+          <w:sz w:val="20"/>
+          <w:szCs w:val="20"/>
+        </w:rPr>
+        <w:t xml:space="preserve"/>
+      </w:r>
+    </w:p>
+    <w:p>
+      <w:pPr>
+        <w:pStyle w:val="Heading2"/>
+        <w:spacing w:after="80" w:before="240"/>
+      </w:pPr>
+      <w:r>
+        <w:rPr>
+          <w:b/>
+          <w:bCs/>
+          <w:color w:val="1a1a2e"/>
+        </w:rPr>
+        <w:t xml:space="preserve">Bug Fixes</w:t>
+      </w:r>
+    </w:p>
+    <w:p>
+      <w:pPr>
+        <w:pStyle w:val="ListParagraph"/>
+        <w:numPr>
+          <w:ilvl w:val="0"/>
+          <w:numId w:val="1"/>
+        </w:numPr>
+        <w:spacing w:after="60"/>
+      </w:pPr>
+      <w:r>
+        <w:rPr>
+          <w:sz w:val="20"/>
+          <w:szCs w:val="20"/>
+        </w:rPr>
+        <w:t xml:space="preserve">Fixed: Dates stored as Google Sheets serial integers (e.g. 46210) now display as readable dates (e.g. m/d/yyyy) throughout the pitch log.</w:t>
+      </w:r>
+    </w:p>
+    <w:p>
+      <w:pPr>
+        <w:pStyle w:val="ListParagraph"/>
+        <w:numPr>
+          <w:ilvl w:val="0"/>
+          <w:numId w:val="1"/>
+        </w:numPr>
+        <w:spacing w:after="60"/>
+      </w:pPr>
+      <w:r>
+        <w:rPr>
+          <w:sz w:val="20"/>
+          <w:szCs w:val="20"/>
+        </w:rPr>
+        <w:t xml:space="preserve">Fixed: A newly added game is now immediately searchable without requiring a page refresh.</w:t>
+      </w:r>
+    </w:p>
+    <w:p>
+      <w:pPr>
+        <w:pStyle w:val="ListParagraph"/>
+        <w:numPr>
+          <w:ilvl w:val="0"/>
+          <w:numId w:val="1"/>
+        </w:numPr>
+        <w:spacing w:after="60"/>
+      </w:pPr>
+      <w:r>
+        <w:rPr>
+          <w:sz w:val="20"/>
+          <w:szCs w:val="20"/>
+        </w:rPr>
+        <w:t xml:space="preserve">Fixed: When entering a contact as “Name email@example.com” in the Add Pitch dialog, the name and email are now saved to separate fields correctly.</w:t>
+      </w:r>
+    </w:p>
+    <w:p>
+      <w:pPr>
+        <w:spacing w:after="100"/>
+      </w:pPr>
+      <w:r>
+        <w:rPr>
+          <w:sz w:val="20"/>
+          <w:szCs w:val="20"/>
+        </w:rPr>
+        <w:t xml:space="preserve"/>
       </w:r>
     </w:p>
     <w:sectPr>

</xml_diff>

<commit_message>
Release notes: Planned games show in Pitch column (Board view)
</commit_message>
<xml_diff>
--- a/Compendium_Release_Notes.docx
+++ b/Compendium_Release_Notes.docx
@@ -1038,6 +1038,35 @@
           <w:szCs w:val="20"/>
         </w:rPr>
         <w:t xml:space="preserve">Fixed: When entering a contact as “Name email@example.com” in the Add Pitch dialog, the name and email are now saved to separate fields correctly.</w:t>
+      </w:r>
+    </w:p>
+    <w:p>
+      <w:pPr>
+        <w:spacing w:after="100"/>
+      </w:pPr>
+      <w:r>
+        <w:rPr>
+          <w:sz w:val="20"/>
+          <w:szCs w:val="20"/>
+        </w:rPr>
+        <w:t xml:space="preserve"/>
+      </w:r>
+    </w:p>
+    <w:p>
+      <w:pPr>
+        <w:pStyle w:val="ListParagraph"/>
+        <w:numPr>
+          <w:ilvl w:val="0"/>
+          <w:numId w:val="1"/>
+        </w:numPr>
+        <w:spacing w:after="60"/>
+      </w:pPr>
+      <w:r>
+        <w:rPr>
+          <w:sz w:val="20"/>
+          <w:szCs w:val="20"/>
+        </w:rPr>
+        <w:t xml:space="preserve">Fixed: Games with only Planned pitch entries now appear in the Pitch column of the Board view — a Planned entry counts as a pitch record for Kanban placement.</w:t>
       </w:r>
     </w:p>
     <w:p>

</xml_diff>